<commit_message>
Updated phase 2,3 and 4 documents and presentations.
</commit_message>
<xml_diff>
--- a/Final Forensic Case Report.docx
+++ b/Final Forensic Case Report.docx
@@ -22,6 +22,9 @@
       </w:r>
     </w:p>
     <w:p>
+      <w:pPr>
+        <w:ind w:firstLine="720"/>
+      </w:pPr>
       <w:r>
         <w:t xml:space="preserve">This investigation examined a Windows 11 local host machine which was suspected of being compromised after downloading a suspicious file. </w:t>
       </w:r>
@@ -52,48 +55,10 @@
         <w:t>The focus of this investigation was a Windows 11 local machine</w:t>
       </w:r>
       <w:r>
-        <w:t xml:space="preserve">, which was used to simulate a potential security incident. </w:t>
-      </w:r>
-    </w:p>
-    <w:p>
-      <w:r>
-        <w:t xml:space="preserve">This involved: </w:t>
-      </w:r>
-    </w:p>
-    <w:p>
-      <w:pPr>
-        <w:pStyle w:val="ListParagraph"/>
-        <w:numPr>
-          <w:ilvl w:val="0"/>
-          <w:numId w:val="1"/>
-        </w:numPr>
-      </w:pPr>
-      <w:r>
-        <w:t>Downloaded a suspicious file</w:t>
-      </w:r>
-    </w:p>
-    <w:p>
-      <w:pPr>
-        <w:pStyle w:val="ListParagraph"/>
-        <w:numPr>
-          <w:ilvl w:val="0"/>
-          <w:numId w:val="1"/>
-        </w:numPr>
-      </w:pPr>
-      <w:r>
-        <w:t>Executing a file</w:t>
-      </w:r>
-    </w:p>
-    <w:p>
-      <w:pPr>
-        <w:pStyle w:val="ListParagraph"/>
-        <w:numPr>
-          <w:ilvl w:val="0"/>
-          <w:numId w:val="1"/>
-        </w:numPr>
-      </w:pPr>
-      <w:r>
-        <w:t xml:space="preserve">Creating activity </w:t>
+        <w:t>.</w:t>
+      </w:r>
+      <w:r>
+        <w:t xml:space="preserve"> </w:t>
       </w:r>
     </w:p>
     <w:p>
@@ -110,16 +75,7 @@
         <w:t>Image.ad1</w:t>
       </w:r>
       <w:r>
-        <w:t xml:space="preserve"> d</w:t>
-      </w:r>
-      <w:r>
-        <w:t xml:space="preserve">isk </w:t>
-      </w:r>
-      <w:r>
-        <w:t>i</w:t>
-      </w:r>
-      <w:r>
-        <w:t>mage</w:t>
+        <w:t xml:space="preserve"> disk image</w:t>
       </w:r>
       <w:r>
         <w:t xml:space="preserve"> file and </w:t>
@@ -222,8 +178,31 @@
         <w:rPr>
           <w:rFonts w:ascii="Times New Roman" w:hAnsi="Times New Roman" w:cs="Times New Roman"/>
         </w:rPr>
-        <w:lastRenderedPageBreak/>
-        <w:t>Date/Time Acquired 4/21/26 3:08 PM EST</w:t>
+        <w:t>Date/Time Acquired 4/2</w:t>
+      </w:r>
+      <w:r>
+        <w:rPr>
+          <w:rFonts w:ascii="Times New Roman" w:hAnsi="Times New Roman" w:cs="Times New Roman"/>
+        </w:rPr>
+        <w:t>8</w:t>
+      </w:r>
+      <w:r>
+        <w:rPr>
+          <w:rFonts w:ascii="Times New Roman" w:hAnsi="Times New Roman" w:cs="Times New Roman"/>
+        </w:rPr>
+        <w:t>/26 3:</w:t>
+      </w:r>
+      <w:r>
+        <w:rPr>
+          <w:rFonts w:ascii="Times New Roman" w:hAnsi="Times New Roman" w:cs="Times New Roman"/>
+        </w:rPr>
+        <w:t>34</w:t>
+      </w:r>
+      <w:r>
+        <w:rPr>
+          <w:rFonts w:ascii="Times New Roman" w:hAnsi="Times New Roman" w:cs="Times New Roman"/>
+        </w:rPr>
+        <w:t xml:space="preserve"> PM EST</w:t>
       </w:r>
     </w:p>
     <w:p>
@@ -242,7 +221,13 @@
         <w:rPr>
           <w:rFonts w:ascii="Times New Roman" w:hAnsi="Times New Roman" w:cs="Times New Roman"/>
         </w:rPr>
-        <w:t>Hash: c13873ac5f81932d3f4118454c012bc4642187827a1784f03cefcb41b25c0</w:t>
+        <w:t xml:space="preserve">Hash: </w:t>
+      </w:r>
+      <w:r>
+        <w:rPr>
+          <w:rFonts w:ascii="Times New Roman" w:hAnsi="Times New Roman" w:cs="Times New Roman"/>
+        </w:rPr>
+        <w:t>ccc45b5e0c1bc1d2e29ff83a2ba72ec4544db1ebb58d1146ce6ee2aa8d14bdfc</w:t>
       </w:r>
     </w:p>
     <w:p>
@@ -277,6 +262,12 @@
         </w:rPr>
         <w:t>/evidence</w:t>
       </w:r>
+      <w:r>
+        <w:rPr>
+          <w:rFonts w:ascii="Times New Roman" w:hAnsi="Times New Roman" w:cs="Times New Roman"/>
+        </w:rPr>
+        <w:t>/Image.ad1</w:t>
+      </w:r>
     </w:p>
     <w:p>
       <w:pPr>
@@ -294,13 +285,7 @@
         <w:rPr>
           <w:rFonts w:ascii="Times New Roman" w:hAnsi="Times New Roman" w:cs="Times New Roman"/>
         </w:rPr>
-        <w:t>Acquired using FTK Image</w:t>
-      </w:r>
-      <w:r>
-        <w:rPr>
-          <w:rFonts w:ascii="Times New Roman" w:hAnsi="Times New Roman" w:cs="Times New Roman"/>
-        </w:rPr>
-        <w:t>r</w:t>
+        <w:t>Acquired using FTK Imager</w:t>
       </w:r>
     </w:p>
     <w:p>
@@ -315,6 +300,7 @@
         <w:rPr>
           <w:rFonts w:ascii="Times New Roman" w:hAnsi="Times New Roman" w:cs="Times New Roman"/>
         </w:rPr>
+        <w:lastRenderedPageBreak/>
         <w:t>Evidence #2</w:t>
       </w:r>
     </w:p>
@@ -372,7 +358,43 @@
         <w:rPr>
           <w:rFonts w:ascii="Times New Roman" w:hAnsi="Times New Roman" w:cs="Times New Roman"/>
         </w:rPr>
-        <w:t>Date/Time Acquired 4/21/26 3:02 AM EST</w:t>
+        <w:t>Date/Time Acquired 4/2</w:t>
+      </w:r>
+      <w:r>
+        <w:rPr>
+          <w:rFonts w:ascii="Times New Roman" w:hAnsi="Times New Roman" w:cs="Times New Roman"/>
+        </w:rPr>
+        <w:t>8</w:t>
+      </w:r>
+      <w:r>
+        <w:rPr>
+          <w:rFonts w:ascii="Times New Roman" w:hAnsi="Times New Roman" w:cs="Times New Roman"/>
+        </w:rPr>
+        <w:t>/26 3:</w:t>
+      </w:r>
+      <w:r>
+        <w:rPr>
+          <w:rFonts w:ascii="Times New Roman" w:hAnsi="Times New Roman" w:cs="Times New Roman"/>
+        </w:rPr>
+        <w:t>26</w:t>
+      </w:r>
+      <w:r>
+        <w:rPr>
+          <w:rFonts w:ascii="Times New Roman" w:hAnsi="Times New Roman" w:cs="Times New Roman"/>
+        </w:rPr>
+        <w:t xml:space="preserve"> </w:t>
+      </w:r>
+      <w:r>
+        <w:rPr>
+          <w:rFonts w:ascii="Times New Roman" w:hAnsi="Times New Roman" w:cs="Times New Roman"/>
+        </w:rPr>
+        <w:t>PM</w:t>
+      </w:r>
+      <w:r>
+        <w:rPr>
+          <w:rFonts w:ascii="Times New Roman" w:hAnsi="Times New Roman" w:cs="Times New Roman"/>
+        </w:rPr>
+        <w:t xml:space="preserve"> EST</w:t>
       </w:r>
     </w:p>
     <w:p>
@@ -391,7 +413,22 @@
         <w:rPr>
           <w:rFonts w:ascii="Times New Roman" w:hAnsi="Times New Roman" w:cs="Times New Roman"/>
         </w:rPr>
-        <w:t>Hash: f29035292d47d3f667ee7411f7e0a9226589dc1440538cd74c3bcc23902f3994</w:t>
+        <w:t>Hash</w:t>
+      </w:r>
+      <w:r>
+        <w:rPr>
+          <w:rFonts w:ascii="Times New Roman" w:hAnsi="Times New Roman" w:cs="Times New Roman"/>
+        </w:rPr>
+        <w:t>:</w:t>
+      </w:r>
+      <w:r>
+        <w:t xml:space="preserve"> </w:t>
+      </w:r>
+      <w:r>
+        <w:rPr>
+          <w:rFonts w:ascii="Times New Roman" w:hAnsi="Times New Roman" w:cs="Times New Roman"/>
+        </w:rPr>
+        <w:t>b49d6bd310164c45824f09a272140918ebbc6b8ebc12646bc42770ed526ecfd7</w:t>
       </w:r>
     </w:p>
     <w:p>
@@ -478,7 +515,13 @@
         <w:t xml:space="preserve">The tools used for analysis include Autopsy, Volatility, and FTK Imager. Autopsy was chosen to analyze the files within the disk image. Volatility was chosen to analyze the memory dump. </w:t>
       </w:r>
       <w:r>
-        <w:t>Due to storage limits, a logical disk acquisition was done, only acquiring data from the suspicious folder.</w:t>
+        <w:t xml:space="preserve">Due to storage limits, a logical disk acquisition was done, only acquiring data from the </w:t>
+      </w:r>
+      <w:r>
+        <w:t>Downloads</w:t>
+      </w:r>
+      <w:r>
+        <w:t xml:space="preserve"> folder.</w:t>
       </w:r>
       <w:r>
         <w:t xml:space="preserve"> </w:t>
@@ -527,7 +570,10 @@
         <w:pStyle w:val="ListParagraph"/>
       </w:pPr>
       <w:r>
-        <w:t>Unknown exe</w:t>
+        <w:t>Suspicious</w:t>
+      </w:r>
+      <w:r>
+        <w:t xml:space="preserve"> exe</w:t>
       </w:r>
       <w:r>
         <w:t xml:space="preserve"> files</w:t>
@@ -539,31 +585,32 @@
         <w:t>were</w:t>
       </w:r>
       <w:r>
-        <w:t xml:space="preserve"> found in C:\Users\wende\Desktop\SUSPICIOUSFOLDER</w:t>
+        <w:t xml:space="preserve"> found in C:\Users\</w:t>
+      </w:r>
+      <w:r>
+        <w:t>SIx</w:t>
+      </w:r>
+      <w:r>
+        <w:t>\</w:t>
+      </w:r>
+      <w:r>
+        <w:t>Downloads</w:t>
       </w:r>
       <w:r>
         <w:t xml:space="preserve"> </w:t>
       </w:r>
     </w:p>
     <w:p>
-      <w:pPr>
-        <w:pStyle w:val="ListParagraph"/>
-      </w:pPr>
-      <w:r>
-        <w:t>(</w:t>
-      </w:r>
-      <w:proofErr w:type="spellStart"/>
-      <w:r>
-        <w:t>KiloHearts</w:t>
-      </w:r>
-      <w:proofErr w:type="spellEnd"/>
-      <w:r>
-        <w:t xml:space="preserve"> Installer.exe, parsec-windows.exe) </w:t>
-      </w:r>
-    </w:p>
-    <w:p>
-      <w:r>
-        <w:t xml:space="preserve">The parsec-windows.exe is likely the origin of the compromise and was interpreted as malware. </w:t>
+      <w:r>
+        <w:t xml:space="preserve"> </w:t>
+      </w:r>
+    </w:p>
+    <w:p>
+      <w:r>
+        <w:t xml:space="preserve">The </w:t>
+      </w:r>
+      <w:r>
+        <w:t>files may have been downloaded from a site on the internet.</w:t>
       </w:r>
     </w:p>
     <w:p>
@@ -576,16 +623,10 @@
         </w:rPr>
         <w:lastRenderedPageBreak/>
         <w:drawing>
-          <wp:inline distT="0" distB="0" distL="0" distR="0" wp14:anchorId="433C8BB4" wp14:editId="053FA47B">
-            <wp:extent cx="5943600" cy="6354445"/>
-            <wp:effectExtent l="0" t="0" r="0" b="8255"/>
-            <wp:docPr id="920580335" name="Picture 1">
-              <a:extLst xmlns:a="http://schemas.openxmlformats.org/drawingml/2006/main">
-                <a:ext uri="{FF2B5EF4-FFF2-40B4-BE49-F238E27FC236}">
-                  <a16:creationId xmlns:a16="http://schemas.microsoft.com/office/drawing/2014/main" id="{08042C29-6C69-42AB-89AA-E8163A040C9B}"/>
-                </a:ext>
-              </a:extLst>
-            </wp:docPr>
+          <wp:inline distT="0" distB="0" distL="0" distR="0" wp14:anchorId="5F5D73AE" wp14:editId="77194C24">
+            <wp:extent cx="5943600" cy="5531485"/>
+            <wp:effectExtent l="0" t="0" r="0" b="0"/>
+            <wp:docPr id="1866834810" name="Picture 1"/>
             <wp:cNvGraphicFramePr>
               <a:graphicFrameLocks xmlns:a="http://schemas.openxmlformats.org/drawingml/2006/main" noChangeAspect="1"/>
             </wp:cNvGraphicFramePr>
@@ -593,7 +634,7 @@
               <a:graphicData uri="http://schemas.openxmlformats.org/drawingml/2006/picture">
                 <pic:pic xmlns:pic="http://schemas.openxmlformats.org/drawingml/2006/picture">
                   <pic:nvPicPr>
-                    <pic:cNvPr id="920580335" name=""/>
+                    <pic:cNvPr id="1866834810" name=""/>
                     <pic:cNvPicPr/>
                   </pic:nvPicPr>
                   <pic:blipFill>
@@ -605,7 +646,7 @@
                   <pic:spPr>
                     <a:xfrm>
                       <a:off x="0" y="0"/>
-                      <a:ext cx="5943600" cy="6354445"/>
+                      <a:ext cx="5943600" cy="5531485"/>
                     </a:xfrm>
                     <a:prstGeom prst="rect">
                       <a:avLst/>
@@ -626,16 +667,10 @@
         </w:rPr>
         <w:lastRenderedPageBreak/>
         <w:drawing>
-          <wp:inline distT="0" distB="0" distL="0" distR="0" wp14:anchorId="6355DEBA" wp14:editId="155E42A8">
-            <wp:extent cx="5943600" cy="6354445"/>
-            <wp:effectExtent l="0" t="0" r="0" b="8255"/>
-            <wp:docPr id="1664047757" name="Picture 1">
-              <a:extLst xmlns:a="http://schemas.openxmlformats.org/drawingml/2006/main">
-                <a:ext uri="{FF2B5EF4-FFF2-40B4-BE49-F238E27FC236}">
-                  <a16:creationId xmlns:a16="http://schemas.microsoft.com/office/drawing/2014/main" id="{08042C29-6C69-42AB-89AA-E8163A040C9B}"/>
-                </a:ext>
-              </a:extLst>
-            </wp:docPr>
+          <wp:inline distT="0" distB="0" distL="0" distR="0" wp14:anchorId="1E62F757" wp14:editId="3CD0B066">
+            <wp:extent cx="5943600" cy="5589905"/>
+            <wp:effectExtent l="0" t="0" r="0" b="0"/>
+            <wp:docPr id="1886375350" name="Picture 1"/>
             <wp:cNvGraphicFramePr>
               <a:graphicFrameLocks xmlns:a="http://schemas.openxmlformats.org/drawingml/2006/main" noChangeAspect="1"/>
             </wp:cNvGraphicFramePr>
@@ -643,118 +678,7 @@
               <a:graphicData uri="http://schemas.openxmlformats.org/drawingml/2006/picture">
                 <pic:pic xmlns:pic="http://schemas.openxmlformats.org/drawingml/2006/picture">
                   <pic:nvPicPr>
-                    <pic:cNvPr id="920580335" name=""/>
-                    <pic:cNvPicPr/>
-                  </pic:nvPicPr>
-                  <pic:blipFill>
-                    <a:blip r:embed="rId8"/>
-                    <a:stretch>
-                      <a:fillRect/>
-                    </a:stretch>
-                  </pic:blipFill>
-                  <pic:spPr>
-                    <a:xfrm>
-                      <a:off x="0" y="0"/>
-                      <a:ext cx="5943600" cy="6354445"/>
-                    </a:xfrm>
-                    <a:prstGeom prst="rect">
-                      <a:avLst/>
-                    </a:prstGeom>
-                  </pic:spPr>
-                </pic:pic>
-              </a:graphicData>
-            </a:graphic>
-          </wp:inline>
-        </w:drawing>
-      </w:r>
-    </w:p>
-    <w:p/>
-    <w:p/>
-    <w:p/>
-    <w:p/>
-    <w:p/>
-    <w:p>
-      <w:pPr>
-        <w:pStyle w:val="Heading2"/>
-      </w:pPr>
-      <w:r>
-        <w:lastRenderedPageBreak/>
-        <w:t>Memory Analysis reveals:</w:t>
-      </w:r>
-    </w:p>
-    <w:p>
-      <w:pPr>
-        <w:pStyle w:val="ListParagraph"/>
-        <w:numPr>
-          <w:ilvl w:val="0"/>
-          <w:numId w:val="2"/>
-        </w:numPr>
-      </w:pPr>
-      <w:r>
-        <w:t>Multiple Suspicious .exe being ran</w:t>
-      </w:r>
-      <w:r>
-        <w:br/>
-        <w:t>Greenshot.exe</w:t>
-      </w:r>
-      <w:r>
-        <w:br/>
-        <w:t>atieah64.exe</w:t>
-      </w:r>
-      <w:r>
-        <w:br/>
-        <w:t>aimgr.exe</w:t>
-      </w:r>
-      <w:r>
-        <w:br/>
-        <w:t>ai.exe</w:t>
-      </w:r>
-      <w:r>
-        <w:br/>
-        <w:t>AUEPDU.exe</w:t>
-      </w:r>
-    </w:p>
-    <w:p>
-      <w:pPr>
-        <w:ind w:left="360"/>
-      </w:pPr>
-      <w:r>
-        <w:t xml:space="preserve">These </w:t>
-      </w:r>
-      <w:r>
-        <w:t>files were interpreted as</w:t>
-      </w:r>
-      <w:r>
-        <w:t xml:space="preserve"> suspicious due to their unknown nature. </w:t>
-      </w:r>
-      <w:r>
-        <w:t xml:space="preserve"> </w:t>
-      </w:r>
-    </w:p>
-    <w:p>
-      <w:r>
-        <w:rPr>
-          <w:noProof/>
-        </w:rPr>
-        <w:drawing>
-          <wp:inline distT="0" distB="0" distL="0" distR="0" wp14:anchorId="401BE3A7" wp14:editId="65D64675">
-            <wp:extent cx="5943600" cy="4734560"/>
-            <wp:effectExtent l="0" t="0" r="0" b="8890"/>
-            <wp:docPr id="1653964184" name="Picture 1">
-              <a:extLst xmlns:a="http://schemas.openxmlformats.org/drawingml/2006/main">
-                <a:ext uri="{FF2B5EF4-FFF2-40B4-BE49-F238E27FC236}">
-                  <a16:creationId xmlns:a16="http://schemas.microsoft.com/office/drawing/2014/main" id="{54742062-7451-44F9-8C0E-26813FB1E773}"/>
-                </a:ext>
-              </a:extLst>
-            </wp:docPr>
-            <wp:cNvGraphicFramePr>
-              <a:graphicFrameLocks xmlns:a="http://schemas.openxmlformats.org/drawingml/2006/main" noChangeAspect="1"/>
-            </wp:cNvGraphicFramePr>
-            <a:graphic xmlns:a="http://schemas.openxmlformats.org/drawingml/2006/main">
-              <a:graphicData uri="http://schemas.openxmlformats.org/drawingml/2006/picture">
-                <pic:pic xmlns:pic="http://schemas.openxmlformats.org/drawingml/2006/picture">
-                  <pic:nvPicPr>
-                    <pic:cNvPr id="1653964184" name=""/>
+                    <pic:cNvPr id="1886375350" name=""/>
                     <pic:cNvPicPr/>
                   </pic:nvPicPr>
                   <pic:blipFill>
@@ -766,7 +690,7 @@
                   <pic:spPr>
                     <a:xfrm>
                       <a:off x="0" y="0"/>
-                      <a:ext cx="5943600" cy="4734560"/>
+                      <a:ext cx="5943600" cy="5589905"/>
                     </a:xfrm>
                     <a:prstGeom prst="rect">
                       <a:avLst/>
@@ -780,49 +704,16 @@
       </w:r>
     </w:p>
     <w:p>
-      <w:pPr>
-        <w:ind w:firstLine="720"/>
-      </w:pPr>
-      <w:r>
-        <w:t xml:space="preserve">An additional scan was done where the parsec-windows.exe was </w:t>
-      </w:r>
-      <w:proofErr w:type="gramStart"/>
-      <w:r>
-        <w:t>ran</w:t>
-      </w:r>
-      <w:proofErr w:type="gramEnd"/>
-      <w:r>
-        <w:t xml:space="preserve"> through </w:t>
-      </w:r>
-      <w:proofErr w:type="spellStart"/>
-      <w:r>
-        <w:t>VirusTotal</w:t>
-      </w:r>
-      <w:proofErr w:type="spellEnd"/>
-      <w:r>
-        <w:t xml:space="preserve"> and </w:t>
-      </w:r>
-      <w:r>
-        <w:t>flagged</w:t>
-      </w:r>
-      <w:r>
-        <w:t xml:space="preserve"> </w:t>
-      </w:r>
-      <w:r>
-        <w:t xml:space="preserve">as malicious, increasing the likelihood that this was the source of </w:t>
-      </w:r>
-      <w:r>
-        <w:t xml:space="preserve">malware. </w:t>
-      </w:r>
       <w:r>
         <w:rPr>
           <w:noProof/>
         </w:rPr>
+        <w:lastRenderedPageBreak/>
         <w:drawing>
-          <wp:inline distT="0" distB="0" distL="0" distR="0" wp14:anchorId="3FC57E55" wp14:editId="51C5FC57">
-            <wp:extent cx="5943600" cy="599440"/>
+          <wp:inline distT="0" distB="0" distL="0" distR="0" wp14:anchorId="30A5E666" wp14:editId="3F1BF531">
+            <wp:extent cx="5943600" cy="5605780"/>
             <wp:effectExtent l="0" t="0" r="0" b="0"/>
-            <wp:docPr id="2126365268" name="Picture 1"/>
+            <wp:docPr id="970896170" name="Picture 1"/>
             <wp:cNvGraphicFramePr>
               <a:graphicFrameLocks xmlns:a="http://schemas.openxmlformats.org/drawingml/2006/main" noChangeAspect="1"/>
             </wp:cNvGraphicFramePr>
@@ -830,7 +721,7 @@
               <a:graphicData uri="http://schemas.openxmlformats.org/drawingml/2006/picture">
                 <pic:pic xmlns:pic="http://schemas.openxmlformats.org/drawingml/2006/picture">
                   <pic:nvPicPr>
-                    <pic:cNvPr id="2126365268" name=""/>
+                    <pic:cNvPr id="970896170" name=""/>
                     <pic:cNvPicPr/>
                   </pic:nvPicPr>
                   <pic:blipFill>
@@ -842,7 +733,7 @@
                   <pic:spPr>
                     <a:xfrm>
                       <a:off x="0" y="0"/>
-                      <a:ext cx="5943600" cy="599440"/>
+                      <a:ext cx="5943600" cy="5605780"/>
                     </a:xfrm>
                     <a:prstGeom prst="rect">
                       <a:avLst/>
@@ -855,67 +746,68 @@
         </w:drawing>
       </w:r>
     </w:p>
+    <w:p/>
+    <w:p>
+      <w:r>
+        <w:lastRenderedPageBreak/>
+        <w:drawing>
+          <wp:inline distT="0" distB="0" distL="0" distR="0" wp14:anchorId="46D333F6" wp14:editId="218F3591">
+            <wp:extent cx="5943600" cy="5685790"/>
+            <wp:effectExtent l="0" t="0" r="0" b="0"/>
+            <wp:docPr id="2050391756" name="Picture 2" descr="A screenshot of a computer&#10;&#10;AI-generated content may be incorrect."/>
+            <wp:cNvGraphicFramePr>
+              <a:graphicFrameLocks xmlns:a="http://schemas.openxmlformats.org/drawingml/2006/main" noChangeAspect="1"/>
+            </wp:cNvGraphicFramePr>
+            <a:graphic xmlns:a="http://schemas.openxmlformats.org/drawingml/2006/main">
+              <a:graphicData uri="http://schemas.openxmlformats.org/drawingml/2006/picture">
+                <pic:pic xmlns:pic="http://schemas.openxmlformats.org/drawingml/2006/picture">
+                  <pic:nvPicPr>
+                    <pic:cNvPr id="0" name="Picture 6" descr="A screenshot of a computer&#10;&#10;AI-generated content may be incorrect."/>
+                    <pic:cNvPicPr>
+                      <a:picLocks noChangeAspect="1" noChangeArrowheads="1"/>
+                    </pic:cNvPicPr>
+                  </pic:nvPicPr>
+                  <pic:blipFill>
+                    <a:blip r:embed="rId11">
+                      <a:extLst>
+                        <a:ext uri="{28A0092B-C50C-407E-A947-70E740481C1C}">
+                          <a14:useLocalDpi xmlns:a14="http://schemas.microsoft.com/office/drawing/2010/main" val="0"/>
+                        </a:ext>
+                      </a:extLst>
+                    </a:blip>
+                    <a:srcRect/>
+                    <a:stretch>
+                      <a:fillRect/>
+                    </a:stretch>
+                  </pic:blipFill>
+                  <pic:spPr bwMode="auto">
+                    <a:xfrm>
+                      <a:off x="0" y="0"/>
+                      <a:ext cx="5943600" cy="5685790"/>
+                    </a:xfrm>
+                    <a:prstGeom prst="rect">
+                      <a:avLst/>
+                    </a:prstGeom>
+                    <a:noFill/>
+                    <a:ln>
+                      <a:noFill/>
+                    </a:ln>
+                  </pic:spPr>
+                </pic:pic>
+              </a:graphicData>
+            </a:graphic>
+          </wp:inline>
+        </w:drawing>
+      </w:r>
+    </w:p>
+    <w:p/>
+    <w:p/>
     <w:p>
       <w:pPr>
         <w:pStyle w:val="Heading2"/>
       </w:pPr>
       <w:r>
-        <w:lastRenderedPageBreak/>
-        <w:t>Timeline Reconstruction</w:t>
-      </w:r>
-    </w:p>
-    <w:p>
-      <w:r>
-        <w:t xml:space="preserve">This timeline shows when the exe files were initially </w:t>
-      </w:r>
-      <w:proofErr w:type="gramStart"/>
-      <w:r>
-        <w:t>ran</w:t>
-      </w:r>
-      <w:proofErr w:type="gramEnd"/>
-      <w:r>
-        <w:t xml:space="preserve">. </w:t>
-      </w:r>
-    </w:p>
-    <w:p>
-      <w:r>
-        <w:t>4/18/26 15:40:04 AUEPOU.exe</w:t>
-      </w:r>
-    </w:p>
-    <w:p>
-      <w:r>
-        <w:t xml:space="preserve">4/18/26 </w:t>
-      </w:r>
-      <w:proofErr w:type="gramStart"/>
-      <w:r>
-        <w:t>15</w:t>
-      </w:r>
-      <w:proofErr w:type="gramEnd"/>
-      <w:r>
-        <w:t>:40:40 Greenshot.exe</w:t>
-      </w:r>
-    </w:p>
-    <w:p>
-      <w:r>
-        <w:t>4/18/26 15:43 atieah64.exe</w:t>
-      </w:r>
-    </w:p>
-    <w:p>
-      <w:r>
-        <w:t>4/20/26 16:17 aimgr.exe</w:t>
-      </w:r>
-    </w:p>
-    <w:p>
-      <w:r>
-        <w:t>4/20/26 16:17 ai.exe</w:t>
-      </w:r>
-    </w:p>
-    <w:p>
-      <w:pPr>
-        <w:pStyle w:val="Heading2"/>
-      </w:pPr>
-      <w:r>
-        <w:t>Conclusion and Assessment</w:t>
+        <w:t>Memory Analysis reveals:</w:t>
       </w:r>
     </w:p>
     <w:p>
@@ -927,13 +819,263 @@
         </w:numPr>
       </w:pPr>
       <w:r>
-        <w:t xml:space="preserve">This investigation concluded that the system was compromised after downloading the parsec-windows.exe </w:t>
-      </w:r>
-      <w:r>
-        <w:t>unauthorized file from the internet</w:t>
+        <w:t xml:space="preserve">Multiple </w:t>
+      </w:r>
+      <w:r>
+        <w:t>unknown processes were found</w:t>
+      </w:r>
+    </w:p>
+    <w:p>
+      <w:pPr>
+        <w:ind w:left="360"/>
+      </w:pPr>
+      <w:r>
+        <w:t xml:space="preserve">These </w:t>
+      </w:r>
+      <w:r>
+        <w:t>files were interpreted as</w:t>
+      </w:r>
+      <w:r>
+        <w:t xml:space="preserve"> suspicious due to their unknown nature. </w:t>
+      </w:r>
+      <w:r>
+        <w:t xml:space="preserve"> </w:t>
+      </w:r>
+    </w:p>
+    <w:p>
+      <w:r>
+        <w:rPr>
+          <w:noProof/>
+        </w:rPr>
+        <w:lastRenderedPageBreak/>
+        <w:drawing>
+          <wp:inline distT="0" distB="0" distL="0" distR="0" wp14:anchorId="4DD5268A" wp14:editId="75E1A4AC">
+            <wp:extent cx="5943600" cy="1887220"/>
+            <wp:effectExtent l="0" t="0" r="0" b="0"/>
+            <wp:docPr id="1911496280" name="Picture 1"/>
+            <wp:cNvGraphicFramePr>
+              <a:graphicFrameLocks xmlns:a="http://schemas.openxmlformats.org/drawingml/2006/main" noChangeAspect="1"/>
+            </wp:cNvGraphicFramePr>
+            <a:graphic xmlns:a="http://schemas.openxmlformats.org/drawingml/2006/main">
+              <a:graphicData uri="http://schemas.openxmlformats.org/drawingml/2006/picture">
+                <pic:pic xmlns:pic="http://schemas.openxmlformats.org/drawingml/2006/picture">
+                  <pic:nvPicPr>
+                    <pic:cNvPr id="1911496280" name=""/>
+                    <pic:cNvPicPr/>
+                  </pic:nvPicPr>
+                  <pic:blipFill>
+                    <a:blip r:embed="rId12"/>
+                    <a:stretch>
+                      <a:fillRect/>
+                    </a:stretch>
+                  </pic:blipFill>
+                  <pic:spPr>
+                    <a:xfrm>
+                      <a:off x="0" y="0"/>
+                      <a:ext cx="5943600" cy="1887220"/>
+                    </a:xfrm>
+                    <a:prstGeom prst="rect">
+                      <a:avLst/>
+                    </a:prstGeom>
+                  </pic:spPr>
+                </pic:pic>
+              </a:graphicData>
+            </a:graphic>
+          </wp:inline>
+        </w:drawing>
+      </w:r>
+    </w:p>
+    <w:p>
+      <w:pPr>
+        <w:ind w:firstLine="720"/>
+      </w:pPr>
+      <w:r>
+        <w:t xml:space="preserve">An additional scan was done where the </w:t>
+      </w:r>
+      <w:r>
+        <w:t>files found on the image disk were run on</w:t>
+      </w:r>
+      <w:r>
+        <w:t xml:space="preserve"> </w:t>
+      </w:r>
+      <w:proofErr w:type="spellStart"/>
+      <w:r>
+        <w:t>VirusTotal</w:t>
+      </w:r>
+      <w:proofErr w:type="spellEnd"/>
+      <w:r>
+        <w:t xml:space="preserve"> and</w:t>
+      </w:r>
+      <w:r>
+        <w:t xml:space="preserve"> multiple were</w:t>
+      </w:r>
+      <w:r>
+        <w:t xml:space="preserve"> </w:t>
+      </w:r>
+      <w:r>
+        <w:t>flagged</w:t>
+      </w:r>
+      <w:r>
+        <w:t xml:space="preserve"> </w:t>
+      </w:r>
+      <w:r>
+        <w:t>as malicious</w:t>
       </w:r>
       <w:r>
         <w:t xml:space="preserve">. </w:t>
+      </w:r>
+      <w:r>
+        <w:rPr>
+          <w:noProof/>
+        </w:rPr>
+        <w:drawing>
+          <wp:inline distT="0" distB="0" distL="0" distR="0" wp14:anchorId="4F6A18D3" wp14:editId="60DCDE77">
+            <wp:extent cx="5943600" cy="1248410"/>
+            <wp:effectExtent l="0" t="0" r="0" b="8890"/>
+            <wp:docPr id="2127874733" name="Picture 1"/>
+            <wp:cNvGraphicFramePr>
+              <a:graphicFrameLocks xmlns:a="http://schemas.openxmlformats.org/drawingml/2006/main" noChangeAspect="1"/>
+            </wp:cNvGraphicFramePr>
+            <a:graphic xmlns:a="http://schemas.openxmlformats.org/drawingml/2006/main">
+              <a:graphicData uri="http://schemas.openxmlformats.org/drawingml/2006/picture">
+                <pic:pic xmlns:pic="http://schemas.openxmlformats.org/drawingml/2006/picture">
+                  <pic:nvPicPr>
+                    <pic:cNvPr id="2127874733" name=""/>
+                    <pic:cNvPicPr/>
+                  </pic:nvPicPr>
+                  <pic:blipFill>
+                    <a:blip r:embed="rId13"/>
+                    <a:stretch>
+                      <a:fillRect/>
+                    </a:stretch>
+                  </pic:blipFill>
+                  <pic:spPr>
+                    <a:xfrm>
+                      <a:off x="0" y="0"/>
+                      <a:ext cx="5943600" cy="1248410"/>
+                    </a:xfrm>
+                    <a:prstGeom prst="rect">
+                      <a:avLst/>
+                    </a:prstGeom>
+                  </pic:spPr>
+                </pic:pic>
+              </a:graphicData>
+            </a:graphic>
+          </wp:inline>
+        </w:drawing>
+      </w:r>
+    </w:p>
+    <w:p>
+      <w:pPr>
+        <w:pStyle w:val="Heading2"/>
+      </w:pPr>
+      <w:r>
+        <w:t>Timeline Reconstruction</w:t>
+      </w:r>
+    </w:p>
+    <w:p>
+      <w:pPr>
+        <w:numPr>
+          <w:ilvl w:val="0"/>
+          <w:numId w:val="3"/>
+        </w:numPr>
+      </w:pPr>
+      <w:r>
+        <w:t>4/28/26 3:34 PM EST – Disk image created </w:t>
+      </w:r>
+      <w:r>
+        <w:rPr>
+          <w:rFonts w:ascii="Arial" w:hAnsi="Arial" w:cs="Arial"/>
+        </w:rPr>
+        <w:t>​</w:t>
+      </w:r>
+    </w:p>
+    <w:p>
+      <w:pPr>
+        <w:numPr>
+          <w:ilvl w:val="0"/>
+          <w:numId w:val="3"/>
+        </w:numPr>
+      </w:pPr>
+      <w:r>
+        <w:t>4/28/26 3:26 PM EST – Memory Dump created </w:t>
+      </w:r>
+      <w:r>
+        <w:rPr>
+          <w:rFonts w:ascii="Arial" w:hAnsi="Arial" w:cs="Arial"/>
+        </w:rPr>
+        <w:t>​</w:t>
+      </w:r>
+    </w:p>
+    <w:p>
+      <w:pPr>
+        <w:numPr>
+          <w:ilvl w:val="0"/>
+          <w:numId w:val="3"/>
+        </w:numPr>
+      </w:pPr>
+      <w:r>
+        <w:t xml:space="preserve">4/28/26 6:06-6:11 PM EST – Volatility used to analyze the </w:t>
+      </w:r>
+      <w:r>
+        <w:t>memory dump</w:t>
+      </w:r>
+      <w:r>
+        <w:t xml:space="preserve"> file, discovering unknown files</w:t>
+      </w:r>
+      <w:r>
+        <w:rPr>
+          <w:rFonts w:ascii="Arial" w:hAnsi="Arial" w:cs="Arial"/>
+        </w:rPr>
+        <w:t>​</w:t>
+      </w:r>
+    </w:p>
+    <w:p>
+      <w:pPr>
+        <w:numPr>
+          <w:ilvl w:val="0"/>
+          <w:numId w:val="3"/>
+        </w:numPr>
+      </w:pPr>
+      <w:r>
+        <w:t>4/29/26 5:18-5:31 PM EST – parsec-windows.exe, eicar.com, drop(eicar.txt), and windows.bat identified in Autopsy </w:t>
+      </w:r>
+      <w:r>
+        <w:rPr>
+          <w:rFonts w:ascii="Arial" w:hAnsi="Arial" w:cs="Arial"/>
+        </w:rPr>
+        <w:t>​</w:t>
+      </w:r>
+    </w:p>
+    <w:p>
+      <w:pPr>
+        <w:numPr>
+          <w:ilvl w:val="0"/>
+          <w:numId w:val="3"/>
+        </w:numPr>
+      </w:pPr>
+      <w:r>
+        <w:t xml:space="preserve">4/29/26 5:35-5:37 PM EST </w:t>
+      </w:r>
+      <w:r>
+        <w:t>- Identified</w:t>
+      </w:r>
+      <w:r>
+        <w:t xml:space="preserve"> files scanned with </w:t>
+      </w:r>
+      <w:proofErr w:type="spellStart"/>
+      <w:r>
+        <w:t>VirusTotal</w:t>
+      </w:r>
+      <w:proofErr w:type="spellEnd"/>
+    </w:p>
+    <w:p/>
+    <w:p>
+      <w:pPr>
+        <w:pStyle w:val="Heading2"/>
+      </w:pPr>
+      <w:r>
+        <w:t>Conclusion and Assessment</w:t>
       </w:r>
     </w:p>
     <w:p>
@@ -945,18 +1087,13 @@
         </w:numPr>
       </w:pPr>
       <w:r>
-        <w:t>The V</w:t>
-      </w:r>
-      <w:proofErr w:type="spellStart"/>
-      <w:r>
-        <w:t>irusTotal</w:t>
-      </w:r>
-      <w:proofErr w:type="spellEnd"/>
-      <w:r>
-        <w:t xml:space="preserve"> Flag and presence of suspicious files and .exe files</w:t>
-      </w:r>
-      <w:r>
-        <w:t xml:space="preserve"> led to this conclusion. </w:t>
+        <w:t xml:space="preserve">This investigation concluded that the system was compromised after </w:t>
+      </w:r>
+      <w:r>
+        <w:t>downloading one of the suspicious files from the internet</w:t>
+      </w:r>
+      <w:r>
+        <w:t xml:space="preserve"> </w:t>
       </w:r>
     </w:p>
     <w:p>
@@ -968,7 +1105,24 @@
         </w:numPr>
       </w:pPr>
       <w:r>
-        <w:t>Confidence level is Moderate to High</w:t>
+        <w:t xml:space="preserve">The </w:t>
+      </w:r>
+      <w:proofErr w:type="spellStart"/>
+      <w:r>
+        <w:t>VirusTotal</w:t>
+      </w:r>
+      <w:proofErr w:type="spellEnd"/>
+      <w:r>
+        <w:t xml:space="preserve"> Flag and presence</w:t>
+      </w:r>
+      <w:r>
+        <w:t xml:space="preserve"> of unknown processes</w:t>
+      </w:r>
+      <w:r>
+        <w:t xml:space="preserve"> </w:t>
+      </w:r>
+      <w:r>
+        <w:t xml:space="preserve">led to this conclusion. </w:t>
       </w:r>
     </w:p>
     <w:p>
@@ -980,10 +1134,31 @@
         </w:numPr>
       </w:pPr>
       <w:r>
-        <w:t xml:space="preserve">The user should </w:t>
-      </w:r>
-      <w:r>
-        <w:t xml:space="preserve">install and run anti-virus software and avoid downloading untrusted files. </w:t>
+        <w:t>Confidence level is Moderate to High</w:t>
+      </w:r>
+    </w:p>
+    <w:p>
+      <w:pPr>
+        <w:pStyle w:val="ListParagraph"/>
+        <w:numPr>
+          <w:ilvl w:val="0"/>
+          <w:numId w:val="2"/>
+        </w:numPr>
+      </w:pPr>
+      <w:r>
+        <w:t xml:space="preserve">The user </w:t>
+      </w:r>
+      <w:r>
+        <w:t xml:space="preserve">should </w:t>
+      </w:r>
+      <w:r>
+        <w:t xml:space="preserve">avoid downloading </w:t>
+      </w:r>
+      <w:r>
+        <w:t>files from untrusted websites</w:t>
+      </w:r>
+      <w:r>
+        <w:t xml:space="preserve">. </w:t>
       </w:r>
     </w:p>
     <w:p>
@@ -1234,11 +1409,163 @@
       </w:rPr>
     </w:lvl>
   </w:abstractNum>
+  <w:abstractNum w:abstractNumId="2" w15:restartNumberingAfterBreak="0">
+    <w:nsid w:val="72100ED5"/>
+    <w:multiLevelType w:val="multilevel"/>
+    <w:tmpl w:val="453ECABA"/>
+    <w:lvl w:ilvl="0">
+      <w:start w:val="1"/>
+      <w:numFmt w:val="bullet"/>
+      <w:lvlText w:val=""/>
+      <w:lvlJc w:val="left"/>
+      <w:pPr>
+        <w:tabs>
+          <w:tab w:val="num" w:pos="720"/>
+        </w:tabs>
+        <w:ind w:left="720" w:hanging="360"/>
+      </w:pPr>
+      <w:rPr>
+        <w:rFonts w:ascii="Symbol" w:hAnsi="Symbol" w:hint="default"/>
+        <w:sz w:val="20"/>
+      </w:rPr>
+    </w:lvl>
+    <w:lvl w:ilvl="1" w:tentative="1">
+      <w:start w:val="1"/>
+      <w:numFmt w:val="bullet"/>
+      <w:lvlText w:val=""/>
+      <w:lvlJc w:val="left"/>
+      <w:pPr>
+        <w:tabs>
+          <w:tab w:val="num" w:pos="1440"/>
+        </w:tabs>
+        <w:ind w:left="1440" w:hanging="360"/>
+      </w:pPr>
+      <w:rPr>
+        <w:rFonts w:ascii="Symbol" w:hAnsi="Symbol" w:hint="default"/>
+        <w:sz w:val="20"/>
+      </w:rPr>
+    </w:lvl>
+    <w:lvl w:ilvl="2" w:tentative="1">
+      <w:start w:val="1"/>
+      <w:numFmt w:val="bullet"/>
+      <w:lvlText w:val=""/>
+      <w:lvlJc w:val="left"/>
+      <w:pPr>
+        <w:tabs>
+          <w:tab w:val="num" w:pos="2160"/>
+        </w:tabs>
+        <w:ind w:left="2160" w:hanging="360"/>
+      </w:pPr>
+      <w:rPr>
+        <w:rFonts w:ascii="Symbol" w:hAnsi="Symbol" w:hint="default"/>
+        <w:sz w:val="20"/>
+      </w:rPr>
+    </w:lvl>
+    <w:lvl w:ilvl="3" w:tentative="1">
+      <w:start w:val="1"/>
+      <w:numFmt w:val="bullet"/>
+      <w:lvlText w:val=""/>
+      <w:lvlJc w:val="left"/>
+      <w:pPr>
+        <w:tabs>
+          <w:tab w:val="num" w:pos="2880"/>
+        </w:tabs>
+        <w:ind w:left="2880" w:hanging="360"/>
+      </w:pPr>
+      <w:rPr>
+        <w:rFonts w:ascii="Symbol" w:hAnsi="Symbol" w:hint="default"/>
+        <w:sz w:val="20"/>
+      </w:rPr>
+    </w:lvl>
+    <w:lvl w:ilvl="4" w:tentative="1">
+      <w:start w:val="1"/>
+      <w:numFmt w:val="bullet"/>
+      <w:lvlText w:val=""/>
+      <w:lvlJc w:val="left"/>
+      <w:pPr>
+        <w:tabs>
+          <w:tab w:val="num" w:pos="3600"/>
+        </w:tabs>
+        <w:ind w:left="3600" w:hanging="360"/>
+      </w:pPr>
+      <w:rPr>
+        <w:rFonts w:ascii="Symbol" w:hAnsi="Symbol" w:hint="default"/>
+        <w:sz w:val="20"/>
+      </w:rPr>
+    </w:lvl>
+    <w:lvl w:ilvl="5" w:tentative="1">
+      <w:start w:val="1"/>
+      <w:numFmt w:val="bullet"/>
+      <w:lvlText w:val=""/>
+      <w:lvlJc w:val="left"/>
+      <w:pPr>
+        <w:tabs>
+          <w:tab w:val="num" w:pos="4320"/>
+        </w:tabs>
+        <w:ind w:left="4320" w:hanging="360"/>
+      </w:pPr>
+      <w:rPr>
+        <w:rFonts w:ascii="Symbol" w:hAnsi="Symbol" w:hint="default"/>
+        <w:sz w:val="20"/>
+      </w:rPr>
+    </w:lvl>
+    <w:lvl w:ilvl="6" w:tentative="1">
+      <w:start w:val="1"/>
+      <w:numFmt w:val="bullet"/>
+      <w:lvlText w:val=""/>
+      <w:lvlJc w:val="left"/>
+      <w:pPr>
+        <w:tabs>
+          <w:tab w:val="num" w:pos="5040"/>
+        </w:tabs>
+        <w:ind w:left="5040" w:hanging="360"/>
+      </w:pPr>
+      <w:rPr>
+        <w:rFonts w:ascii="Symbol" w:hAnsi="Symbol" w:hint="default"/>
+        <w:sz w:val="20"/>
+      </w:rPr>
+    </w:lvl>
+    <w:lvl w:ilvl="7" w:tentative="1">
+      <w:start w:val="1"/>
+      <w:numFmt w:val="bullet"/>
+      <w:lvlText w:val=""/>
+      <w:lvlJc w:val="left"/>
+      <w:pPr>
+        <w:tabs>
+          <w:tab w:val="num" w:pos="5760"/>
+        </w:tabs>
+        <w:ind w:left="5760" w:hanging="360"/>
+      </w:pPr>
+      <w:rPr>
+        <w:rFonts w:ascii="Symbol" w:hAnsi="Symbol" w:hint="default"/>
+        <w:sz w:val="20"/>
+      </w:rPr>
+    </w:lvl>
+    <w:lvl w:ilvl="8" w:tentative="1">
+      <w:start w:val="1"/>
+      <w:numFmt w:val="bullet"/>
+      <w:lvlText w:val=""/>
+      <w:lvlJc w:val="left"/>
+      <w:pPr>
+        <w:tabs>
+          <w:tab w:val="num" w:pos="6480"/>
+        </w:tabs>
+        <w:ind w:left="6480" w:hanging="360"/>
+      </w:pPr>
+      <w:rPr>
+        <w:rFonts w:ascii="Symbol" w:hAnsi="Symbol" w:hint="default"/>
+        <w:sz w:val="20"/>
+      </w:rPr>
+    </w:lvl>
+  </w:abstractNum>
   <w:num w:numId="1" w16cid:durableId="1214997806">
     <w:abstractNumId w:val="0"/>
   </w:num>
   <w:num w:numId="2" w16cid:durableId="1844977341">
     <w:abstractNumId w:val="1"/>
+  </w:num>
+  <w:num w:numId="3" w16cid:durableId="1728262785">
+    <w:abstractNumId w:val="2"/>
   </w:num>
 </w:numbering>
 </file>
@@ -1844,7 +2171,6 @@
   <w:style w:type="character" w:default="1" w:styleId="DefaultParagraphFont">
     <w:name w:val="Default Paragraph Font"/>
     <w:uiPriority w:val="1"/>
-    <w:semiHidden/>
     <w:unhideWhenUsed/>
   </w:style>
   <w:style w:type="table" w:default="1" w:styleId="TableNormal">
@@ -2475,6 +2801,23 @@
 </file>
 
 <file path=customXml/item1.xml><?xml version="1.0" encoding="utf-8"?>
+<p:properties xmlns:p="http://schemas.microsoft.com/office/2006/metadata/properties" xmlns:xsi="http://www.w3.org/2001/XMLSchema-instance" xmlns:pc="http://schemas.microsoft.com/office/infopath/2007/PartnerControls">
+  <documentManagement>
+    <_activity xmlns="8b9e189a-44c8-475e-b768-20dcf1967d90" xsi:nil="true"/>
+  </documentManagement>
+</p:properties>
+</file>
+
+<file path=customXml/item2.xml><?xml version="1.0" encoding="utf-8"?>
+<?mso-contentType ?>
+<FormTemplates xmlns="http://schemas.microsoft.com/sharepoint/v3/contenttype/forms">
+  <Display>DocumentLibraryForm</Display>
+  <Edit>DocumentLibraryForm</Edit>
+  <New>DocumentLibraryForm</New>
+</FormTemplates>
+</file>
+
+<file path=customXml/item3.xml><?xml version="1.0" encoding="utf-8"?>
 <ct:contentTypeSchema xmlns:ct="http://schemas.microsoft.com/office/2006/metadata/contentType" xmlns:ma="http://schemas.microsoft.com/office/2006/metadata/properties/metaAttributes" ct:_="" ma:_="" ma:contentTypeName="Document" ma:contentTypeID="0x0101006E8AFAA3A33C78418C8B25D8C318AEE8" ma:contentTypeVersion="10" ma:contentTypeDescription="Create a new document." ma:contentTypeScope="" ma:versionID="7820c61571d969bd8868e2dec9ad134a">
   <xsd:schema xmlns:xsd="http://www.w3.org/2001/XMLSchema" xmlns:xs="http://www.w3.org/2001/XMLSchema" xmlns:p="http://schemas.microsoft.com/office/2006/metadata/properties" xmlns:ns3="8b9e189a-44c8-475e-b768-20dcf1967d90" targetNamespace="http://schemas.microsoft.com/office/2006/metadata/properties" ma:root="true" ma:fieldsID="5927b057c35c0cda6c852cfa434a42d4" ns3:_="">
     <xsd:import namespace="8b9e189a-44c8-475e-b768-20dcf1967d90"/>
@@ -2656,24 +2999,25 @@
 </ct:contentTypeSchema>
 </file>
 
-<file path=customXml/item2.xml><?xml version="1.0" encoding="utf-8"?>
-<?mso-contentType ?>
-<FormTemplates xmlns="http://schemas.microsoft.com/sharepoint/v3/contenttype/forms">
-  <Display>DocumentLibraryForm</Display>
-  <Edit>DocumentLibraryForm</Edit>
-  <New>DocumentLibraryForm</New>
-</FormTemplates>
+<file path=customXml/itemProps1.xml><?xml version="1.0" encoding="utf-8"?>
+<ds:datastoreItem xmlns:ds="http://schemas.openxmlformats.org/officeDocument/2006/customXml" ds:itemID="{4C904943-62EA-4875-B0DF-EC02BBC00B97}">
+  <ds:schemaRefs>
+    <ds:schemaRef ds:uri="http://schemas.microsoft.com/office/2006/metadata/properties"/>
+    <ds:schemaRef ds:uri="http://schemas.microsoft.com/office/infopath/2007/PartnerControls"/>
+    <ds:schemaRef ds:uri="8b9e189a-44c8-475e-b768-20dcf1967d90"/>
+  </ds:schemaRefs>
+</ds:datastoreItem>
 </file>
 
-<file path=customXml/item3.xml><?xml version="1.0" encoding="utf-8"?>
-<p:properties xmlns:p="http://schemas.microsoft.com/office/2006/metadata/properties" xmlns:xsi="http://www.w3.org/2001/XMLSchema-instance" xmlns:pc="http://schemas.microsoft.com/office/infopath/2007/PartnerControls">
-  <documentManagement>
-    <_activity xmlns="8b9e189a-44c8-475e-b768-20dcf1967d90" xsi:nil="true"/>
-  </documentManagement>
-</p:properties>
+<file path=customXml/itemProps2.xml><?xml version="1.0" encoding="utf-8"?>
+<ds:datastoreItem xmlns:ds="http://schemas.openxmlformats.org/officeDocument/2006/customXml" ds:itemID="{121FA084-B2CD-4F39-934F-85853ED2EF21}">
+  <ds:schemaRefs>
+    <ds:schemaRef ds:uri="http://schemas.microsoft.com/sharepoint/v3/contenttype/forms"/>
+  </ds:schemaRefs>
+</ds:datastoreItem>
 </file>
 
-<file path=customXml/itemProps1.xml><?xml version="1.0" encoding="utf-8"?>
+<file path=customXml/itemProps3.xml><?xml version="1.0" encoding="utf-8"?>
 <ds:datastoreItem xmlns:ds="http://schemas.openxmlformats.org/officeDocument/2006/customXml" ds:itemID="{93915CB5-B941-4791-B029-0A2B17A0D1A3}">
   <ds:schemaRefs>
     <ds:schemaRef ds:uri="http://schemas.microsoft.com/office/2006/metadata/contentType"/>
@@ -2689,22 +3033,4 @@
     <ds:schemaRef ds:uri="http://schemas.microsoft.com/internal/obd"/>
   </ds:schemaRefs>
 </ds:datastoreItem>
-</file>
-
-<file path=customXml/itemProps2.xml><?xml version="1.0" encoding="utf-8"?>
-<ds:datastoreItem xmlns:ds="http://schemas.openxmlformats.org/officeDocument/2006/customXml" ds:itemID="{121FA084-B2CD-4F39-934F-85853ED2EF21}">
-  <ds:schemaRefs>
-    <ds:schemaRef ds:uri="http://schemas.microsoft.com/sharepoint/v3/contenttype/forms"/>
-  </ds:schemaRefs>
-</ds:datastoreItem>
-</file>
-
-<file path=customXml/itemProps3.xml><?xml version="1.0" encoding="utf-8"?>
-<ds:datastoreItem xmlns:ds="http://schemas.openxmlformats.org/officeDocument/2006/customXml" ds:itemID="{4C904943-62EA-4875-B0DF-EC02BBC00B97}">
-  <ds:schemaRefs>
-    <ds:schemaRef ds:uri="http://schemas.microsoft.com/office/2006/metadata/properties"/>
-    <ds:schemaRef ds:uri="http://schemas.microsoft.com/office/infopath/2007/PartnerControls"/>
-    <ds:schemaRef ds:uri="8b9e189a-44c8-475e-b768-20dcf1967d90"/>
-  </ds:schemaRefs>
-</ds:datastoreItem>
 </file>
</xml_diff>